<commit_message>
docs: schema v3.5 — OPD display board (queue room/doctor/now-serving, public /queue/display feed + SSE)
</commit_message>
<xml_diff>
--- a/docs/HealthDoc_Database_Schema.docx
+++ b/docs/HealthDoc_Database_Schema.docx
@@ -15,7 +15,7 @@
         <w:pStyle w:val="Subtitle"/>
       </w:pPr>
       <w:r>
-        <w:t xml:space="preserve">v3.4.1 — precision pass · 2026-07-21</w:t>
+        <w:t xml:space="preserve">v3.5 — OPD display board · 2026-07-21</w:t>
       </w:r>
     </w:p>
     <w:p>
@@ -391,6 +391,41 @@
             </w:pPr>
             <w:r>
               <w:t xml:space="preserve">Security pass: crypto key_version on patient_identifiers, PII rules for notification payloads and error messages, page_size cap, retention notes; synced with architecture.html</w:t>
+            </w:r>
+          </w:p>
+        </w:tc>
+      </w:tr>
+      <w:tr>
+        <w:tc>
+          <w:p>
+            <w:pPr>
+              <w:pStyle w:val="Compact"/>
+              <w:jc w:val="left"/>
+            </w:pPr>
+            <w:r>
+              <w:t xml:space="preserve">v3.5</w:t>
+            </w:r>
+          </w:p>
+        </w:tc>
+        <w:tc>
+          <w:p>
+            <w:pPr>
+              <w:pStyle w:val="Compact"/>
+              <w:jc w:val="left"/>
+            </w:pPr>
+            <w:r>
+              <w:t xml:space="preserve">2026-07-21</w:t>
+            </w:r>
+          </w:p>
+        </w:tc>
+        <w:tc>
+          <w:p>
+            <w:pPr>
+              <w:pStyle w:val="Compact"/>
+              <w:jc w:val="left"/>
+            </w:pPr>
+            <w:r>
+              <w:t xml:space="preserve">OPD display board: queues gain room_id/display_label/now_serving_token_id/is_open; public /queue/display/{dept} board endpoint + SSE stream; token→doctor link and no-PII display contract documented</w:t>
             </w:r>
           </w:p>
         </w:tc>
@@ -6574,7 +6609,7 @@
         <w:t xml:space="preserve"> </w:t>
       </w:r>
       <w:r>
-        <w:t xml:space="preserve">— one row per doctor per department per day</w:t>
+        <w:t xml:space="preserve">— one row per doctor per department per day (this is what ties a token to a doctor)</w:t>
       </w:r>
     </w:p>
     <w:p>
@@ -6603,6 +6638,60 @@
         <w:rPr>
           <w:rStyle w:val="VerbatimChar"/>
         </w:rPr>
+        <w:t xml:space="preserve">room_id        UUID NULL → rooms                 -- where this doctor sits today (copied from</w:t>
+      </w:r>
+      <w:r>
+        <w:br/>
+      </w:r>
+      <w:r>
+        <w:rPr>
+          <w:rStyle w:val="VerbatimChar"/>
+        </w:rPr>
+        <w:t xml:space="preserve">                                                 -- the roster when the queue opens; the display</w:t>
+      </w:r>
+      <w:r>
+        <w:br/>
+      </w:r>
+      <w:r>
+        <w:rPr>
+          <w:rStyle w:val="VerbatimChar"/>
+        </w:rPr>
+        <w:t xml:space="preserve">                                                 -- reads it directly, no roster join)</w:t>
+      </w:r>
+      <w:r>
+        <w:br/>
+      </w:r>
+      <w:r>
+        <w:rPr>
+          <w:rStyle w:val="VerbatimChar"/>
+        </w:rPr>
+        <w:t xml:space="preserve">display_label  varchar(50)                       -- optional friendly name shown on the board,</w:t>
+      </w:r>
+      <w:r>
+        <w:br/>
+      </w:r>
+      <w:r>
+        <w:rPr>
+          <w:rStyle w:val="VerbatimChar"/>
+        </w:rPr>
+        <w:t xml:space="preserve">                                                 -- e.g. "Dr. Sharma · OPD-1"; defaults to doctor full_name</w:t>
+      </w:r>
+      <w:r>
+        <w:br/>
+      </w:r>
+      <w:r>
+        <w:rPr>
+          <w:rStyle w:val="VerbatimChar"/>
+        </w:rPr>
+        <w:t xml:space="preserve">now_serving_token_id UUID NULL → queue_tokens    -- the token currently called (updated on call-next)</w:t>
+      </w:r>
+      <w:r>
+        <w:br/>
+      </w:r>
+      <w:r>
+        <w:rPr>
+          <w:rStyle w:val="VerbatimChar"/>
+        </w:rPr>
         <w:t xml:space="preserve">service_date   date NOT NULL</w:t>
       </w:r>
       <w:r>
@@ -6612,8 +6701,26 @@
         <w:rPr>
           <w:rStyle w:val="VerbatimChar"/>
         </w:rPr>
+        <w:t xml:space="preserve">is_open        boolean NOT NULL DEFAULT true      -- doctor arrived / desk open</w:t>
+      </w:r>
+      <w:r>
+        <w:br/>
+      </w:r>
+      <w:r>
+        <w:rPr>
+          <w:rStyle w:val="VerbatimChar"/>
+        </w:rPr>
         <w:t xml:space="preserve">UNIQUE (department_id, doctor_user_id, service_date)</w:t>
       </w:r>
+      <w:r>
+        <w:br/>
+      </w:r>
+      <w:r>
+        <w:rPr>
+          <w:rStyle w:val="VerbatimChar"/>
+        </w:rPr>
+        <w:t xml:space="preserve">INDEX ix_queues_department_id_service_date (department_id, service_date)</w:t>
+      </w:r>
     </w:p>
     <w:p>
       <w:pPr>
@@ -6698,6 +6805,33 @@
           <w:rStyle w:val="VerbatimChar"/>
         </w:rPr>
         <w:t xml:space="preserve">UNIQUE (queue_id, sequence)                      -- NOT a global unique token string</w:t>
+      </w:r>
+      <w:r>
+        <w:br/>
+      </w:r>
+      <w:r>
+        <w:rPr>
+          <w:rStyle w:val="VerbatimChar"/>
+        </w:rPr>
+        <w:t xml:space="preserve">-- The doctor a token is for = queues.doctor_user_id via queue_id. The token STRING stays</w:t>
+      </w:r>
+      <w:r>
+        <w:br/>
+      </w:r>
+      <w:r>
+        <w:rPr>
+          <w:rStyle w:val="VerbatimChar"/>
+        </w:rPr>
+        <w:t xml:space="preserve">-- dept+sequence (MED-042); the display resolves doctor + room from the queue, so a token</w:t>
+      </w:r>
+      <w:r>
+        <w:br/>
+      </w:r>
+      <w:r>
+        <w:rPr>
+          <w:rStyle w:val="VerbatimChar"/>
+        </w:rPr>
+        <w:t xml:space="preserve">-- can be moved to another doctor (transferred) without reprinting the number.</w:t>
       </w:r>
     </w:p>
     <w:p>
@@ -14008,18 +14142,18 @@
               <w:jc w:val="left"/>
             </w:pPr>
             <w:r>
-              <w:t xml:space="preserve">GET</w:t>
-            </w:r>
-          </w:p>
-        </w:tc>
-        <w:tc>
-          <w:p>
-            <w:pPr>
-              <w:pStyle w:val="Compact"/>
-              <w:jc w:val="left"/>
-            </w:pPr>
-            <w:r>
-              <w:t xml:space="preserve">items sorted by priority tier then</w:t>
+              <w:t xml:space="preserve">GET (staff)</w:t>
+            </w:r>
+          </w:p>
+        </w:tc>
+        <w:tc>
+          <w:p>
+            <w:pPr>
+              <w:pStyle w:val="Compact"/>
+              <w:jc w:val="left"/>
+            </w:pPr>
+            <w:r>
+              <w:t xml:space="preserve">one doctor’s list, sorted by priority tier then</w:t>
             </w:r>
             <w:r>
               <w:t xml:space="preserve"> </w:t>
@@ -14031,7 +14165,19 @@
               <w:t xml:space="preserve">created_at</w:t>
             </w:r>
             <w:r>
-              <w:t xml:space="preserve">; includes</w:t>
+              <w:t xml:space="preserve">; each token adds</w:t>
+            </w:r>
+            <w:r>
+              <w:t xml:space="preserve"> </w:t>
+            </w:r>
+            <w:r>
+              <w:rPr>
+                <w:rStyle w:val="VerbatimChar"/>
+              </w:rPr>
+              <w:t xml:space="preserve">doctor_name, room_number</w:t>
+            </w:r>
+            <w:r>
+              <w:t xml:space="preserve">; header has</w:t>
             </w:r>
             <w:r>
               <w:t xml:space="preserve"> </w:t>
@@ -14067,18 +14213,18 @@
               <w:jc w:val="left"/>
             </w:pPr>
             <w:r>
-              <w:t xml:space="preserve">POST</w:t>
-            </w:r>
-          </w:p>
-        </w:tc>
-        <w:tc>
-          <w:p>
-            <w:pPr>
-              <w:pStyle w:val="Compact"/>
-              <w:jc w:val="left"/>
-            </w:pPr>
-            <w:r>
-              <w:t xml:space="preserve">token with</w:t>
+              <w:t xml:space="preserve">POST (doctor)</w:t>
+            </w:r>
+          </w:p>
+        </w:tc>
+        <w:tc>
+          <w:p>
+            <w:pPr>
+              <w:pStyle w:val="Compact"/>
+              <w:jc w:val="left"/>
+            </w:pPr>
+            <w:r>
+              <w:t xml:space="preserve">calls the next token: sets</w:t>
             </w:r>
             <w:r>
               <w:t xml:space="preserve"> </w:t>
@@ -14089,6 +14235,120 @@
               </w:rPr>
               <w:t xml:space="preserve">status="called", called_at</w:t>
             </w:r>
+            <w:r>
+              <w:t xml:space="preserve">, updates</w:t>
+            </w:r>
+            <w:r>
+              <w:t xml:space="preserve"> </w:t>
+            </w:r>
+            <w:r>
+              <w:rPr>
+                <w:rStyle w:val="VerbatimChar"/>
+              </w:rPr>
+              <w:t xml:space="preserve">queues.now_serving_token_id</w:t>
+            </w:r>
+            <w:r>
+              <w:t xml:space="preserve">, and publishes a</w:t>
+            </w:r>
+            <w:r>
+              <w:t xml:space="preserve"> </w:t>
+            </w:r>
+            <w:r>
+              <w:rPr>
+                <w:rStyle w:val="VerbatimChar"/>
+              </w:rPr>
+              <w:t xml:space="preserve">token_called</w:t>
+            </w:r>
+            <w:r>
+              <w:t xml:space="preserve"> </w:t>
+            </w:r>
+            <w:r>
+              <w:t xml:space="preserve">event to the department display feed</w:t>
+            </w:r>
+          </w:p>
+        </w:tc>
+      </w:tr>
+      <w:tr>
+        <w:tc>
+          <w:p>
+            <w:pPr>
+              <w:pStyle w:val="Compact"/>
+              <w:jc w:val="left"/>
+            </w:pPr>
+            <w:r>
+              <w:rPr>
+                <w:rStyle w:val="VerbatimChar"/>
+                <w:b/>
+              </w:rPr>
+              <w:t xml:space="preserve">/queue/display/{department_id}</w:t>
+            </w:r>
+          </w:p>
+        </w:tc>
+        <w:tc>
+          <w:p>
+            <w:pPr>
+              <w:pStyle w:val="Compact"/>
+              <w:jc w:val="left"/>
+            </w:pPr>
+            <w:r>
+              <w:rPr>
+                <w:b/>
+              </w:rPr>
+              <w:t xml:space="preserve">GET — PUBLIC (no auth)</w:t>
+            </w:r>
+          </w:p>
+        </w:tc>
+        <w:tc>
+          <w:p>
+            <w:pPr>
+              <w:pStyle w:val="Compact"/>
+              <w:jc w:val="left"/>
+            </w:pPr>
+            <w:r>
+              <w:t xml:space="preserve">the wall board outside OPD:</w:t>
+            </w:r>
+            <w:r>
+              <w:t xml:space="preserve"> </w:t>
+            </w:r>
+            <w:r>
+              <w:rPr>
+                <w:rStyle w:val="VerbatimChar"/>
+              </w:rPr>
+              <w:t xml:space="preserve">{department, queues: [{doctor_name, room_number, now_serving (token_display), next_tokens: [token_display,…], waiting_count, is_open}]}</w:t>
+            </w:r>
+            <w:r>
+              <w:t xml:space="preserve">. Contains</w:t>
+            </w:r>
+            <w:r>
+              <w:t xml:space="preserve"> </w:t>
+            </w:r>
+            <w:r>
+              <w:rPr>
+                <w:b/>
+              </w:rPr>
+              <w:t xml:space="preserve">only</w:t>
+            </w:r>
+            <w:r>
+              <w:t xml:space="preserve"> </w:t>
+            </w:r>
+            <w:r>
+              <w:t xml:space="preserve">token strings, doctor names, and rooms —</w:t>
+            </w:r>
+            <w:r>
+              <w:t xml:space="preserve"> </w:t>
+            </w:r>
+            <w:r>
+              <w:rPr>
+                <w:b/>
+              </w:rPr>
+              <w:t xml:space="preserve">never</w:t>
+            </w:r>
+            <w:r>
+              <w:t xml:space="preserve"> </w:t>
+            </w:r>
+            <w:r>
+              <w:t xml:space="preserve">patient names, UHID, or mobile.</w:t>
+            </w:r>
           </w:p>
         </w:tc>
       </w:tr>
@@ -15024,7 +15284,28 @@
         <w:pStyle w:val="BodyText"/>
       </w:pPr>
       <w:r>
-        <w:t xml:space="preserve">WebSocket (queue displays):</w:t>
+        <w:t xml:space="preserve">Display sync (the screen outside OPD stays live without polling). Two interchangeable</w:t>
+      </w:r>
+      <w:r>
+        <w:t xml:space="preserve"> </w:t>
+      </w:r>
+      <w:r>
+        <w:t xml:space="preserve">transports, same payload — a facility uses whichever its display client supports:</w:t>
+      </w:r>
+    </w:p>
+    <w:p>
+      <w:pPr>
+        <w:numPr>
+          <w:ilvl w:val="0"/>
+          <w:numId w:val="1008"/>
+        </w:numPr>
+        <w:pStyle w:val="Compact"/>
+      </w:pPr>
+      <w:r>
+        <w:rPr>
+          <w:b/>
+        </w:rPr>
+        <w:t xml:space="preserve">WebSocket:</w:t>
       </w:r>
       <w:r>
         <w:t xml:space="preserve"> </w:t>
@@ -15035,26 +15316,365 @@
         </w:rPr>
         <w:t xml:space="preserve">wss://&lt;host&gt;/api/v1/ws/queue/{department_id}</w:t>
       </w:r>
-      <w:r>
-        <w:t xml:space="preserve"> </w:t>
-      </w:r>
-      <w:r>
-        <w:t xml:space="preserve">— pushes</w:t>
-      </w:r>
-      <w:r>
-        <w:t xml:space="preserve"> </w:t>
-      </w:r>
-      <w:r>
-        <w:rPr>
-          <w:rStyle w:val="VerbatimChar"/>
-        </w:rPr>
-        <w:t xml:space="preserve">{"event_type": "token_called", "payload": {"token_display": "MED-042", "room_number": "3", "queue_id": "..."}}</w:t>
-      </w:r>
-      <w:r>
-        <w:t xml:space="preserve"> </w:t>
-      </w:r>
-      <w:r>
-        <w:t xml:space="preserve">(same JSON as stored in</w:t>
+    </w:p>
+    <w:p>
+      <w:pPr>
+        <w:numPr>
+          <w:ilvl w:val="0"/>
+          <w:numId w:val="1008"/>
+        </w:numPr>
+        <w:pStyle w:val="Compact"/>
+      </w:pPr>
+      <w:r>
+        <w:rPr>
+          <w:b/>
+        </w:rPr>
+        <w:t xml:space="preserve">SSE:</w:t>
+      </w:r>
+      <w:r>
+        <w:t xml:space="preserve"> </w:t>
+      </w:r>
+      <w:r>
+        <w:rPr>
+          <w:rStyle w:val="VerbatimChar"/>
+        </w:rPr>
+        <w:t xml:space="preserve">GET /api/v1/queue/display/{department_id}/stream</w:t>
+      </w:r>
+      <w:r>
+        <w:t xml:space="preserve"> </w:t>
+      </w:r>
+      <w:r>
+        <w:t xml:space="preserve">(B4-W2-03; easier for a</w:t>
+      </w:r>
+      <w:r>
+        <w:t xml:space="preserve"> </w:t>
+      </w:r>
+      <w:r>
+        <w:t xml:space="preserve">dumb TV browser — one-way, auto-reconnects)</w:t>
+      </w:r>
+    </w:p>
+    <w:p>
+      <w:pPr>
+        <w:pStyle w:val="FirstParagraph"/>
+      </w:pPr>
+      <w:r>
+        <w:t xml:space="preserve">Both are</w:t>
+      </w:r>
+      <w:r>
+        <w:t xml:space="preserve"> </w:t>
+      </w:r>
+      <w:r>
+        <w:rPr>
+          <w:b/>
+        </w:rPr>
+        <w:t xml:space="preserve">public</w:t>
+      </w:r>
+      <w:r>
+        <w:t xml:space="preserve"> </w:t>
+      </w:r>
+      <w:r>
+        <w:t xml:space="preserve">(a wall screen has no login) and push, on every call-next / status</w:t>
+      </w:r>
+      <w:r>
+        <w:t xml:space="preserve"> </w:t>
+      </w:r>
+      <w:r>
+        <w:t xml:space="preserve">change / doctor open-close:</w:t>
+      </w:r>
+    </w:p>
+    <w:p>
+      <w:pPr>
+        <w:pStyle w:val="SourceCode"/>
+      </w:pPr>
+      <w:r>
+        <w:rPr>
+          <w:rStyle w:val="FunctionTok"/>
+        </w:rPr>
+        <w:t xml:space="preserve">{</w:t>
+      </w:r>
+      <w:r>
+        <w:rPr>
+          <w:rStyle w:val="DataTypeTok"/>
+        </w:rPr>
+        <w:t xml:space="preserve">"event_type"</w:t>
+      </w:r>
+      <w:r>
+        <w:rPr>
+          <w:rStyle w:val="FunctionTok"/>
+        </w:rPr>
+        <w:t xml:space="preserve">:</w:t>
+      </w:r>
+      <w:r>
+        <w:rPr>
+          <w:rStyle w:val="NormalTok"/>
+        </w:rPr>
+        <w:t xml:space="preserve"> </w:t>
+      </w:r>
+      <w:r>
+        <w:rPr>
+          <w:rStyle w:val="StringTok"/>
+        </w:rPr>
+        <w:t xml:space="preserve">"token_called"</w:t>
+      </w:r>
+      <w:r>
+        <w:rPr>
+          <w:rStyle w:val="FunctionTok"/>
+        </w:rPr>
+        <w:t xml:space="preserve">,</w:t>
+      </w:r>
+      <w:r>
+        <w:br/>
+      </w:r>
+      <w:r>
+        <w:rPr>
+          <w:rStyle w:val="NormalTok"/>
+        </w:rPr>
+        <w:t xml:space="preserve"> </w:t>
+      </w:r>
+      <w:r>
+        <w:rPr>
+          <w:rStyle w:val="DataTypeTok"/>
+        </w:rPr>
+        <w:t xml:space="preserve">"payload"</w:t>
+      </w:r>
+      <w:r>
+        <w:rPr>
+          <w:rStyle w:val="FunctionTok"/>
+        </w:rPr>
+        <w:t xml:space="preserve">:</w:t>
+      </w:r>
+      <w:r>
+        <w:rPr>
+          <w:rStyle w:val="NormalTok"/>
+        </w:rPr>
+        <w:t xml:space="preserve"> </w:t>
+      </w:r>
+      <w:r>
+        <w:rPr>
+          <w:rStyle w:val="FunctionTok"/>
+        </w:rPr>
+        <w:t xml:space="preserve">{</w:t>
+      </w:r>
+      <w:r>
+        <w:rPr>
+          <w:rStyle w:val="DataTypeTok"/>
+        </w:rPr>
+        <w:t xml:space="preserve">"department_id"</w:t>
+      </w:r>
+      <w:r>
+        <w:rPr>
+          <w:rStyle w:val="FunctionTok"/>
+        </w:rPr>
+        <w:t xml:space="preserve">:</w:t>
+      </w:r>
+      <w:r>
+        <w:rPr>
+          <w:rStyle w:val="NormalTok"/>
+        </w:rPr>
+        <w:t xml:space="preserve"> </w:t>
+      </w:r>
+      <w:r>
+        <w:rPr>
+          <w:rStyle w:val="StringTok"/>
+        </w:rPr>
+        <w:t xml:space="preserve">"…"</w:t>
+      </w:r>
+      <w:r>
+        <w:rPr>
+          <w:rStyle w:val="FunctionTok"/>
+        </w:rPr>
+        <w:t xml:space="preserve">,</w:t>
+      </w:r>
+      <w:r>
+        <w:rPr>
+          <w:rStyle w:val="NormalTok"/>
+        </w:rPr>
+        <w:t xml:space="preserve"> </w:t>
+      </w:r>
+      <w:r>
+        <w:rPr>
+          <w:rStyle w:val="DataTypeTok"/>
+        </w:rPr>
+        <w:t xml:space="preserve">"queue_id"</w:t>
+      </w:r>
+      <w:r>
+        <w:rPr>
+          <w:rStyle w:val="FunctionTok"/>
+        </w:rPr>
+        <w:t xml:space="preserve">:</w:t>
+      </w:r>
+      <w:r>
+        <w:rPr>
+          <w:rStyle w:val="NormalTok"/>
+        </w:rPr>
+        <w:t xml:space="preserve"> </w:t>
+      </w:r>
+      <w:r>
+        <w:rPr>
+          <w:rStyle w:val="StringTok"/>
+        </w:rPr>
+        <w:t xml:space="preserve">"…"</w:t>
+      </w:r>
+      <w:r>
+        <w:rPr>
+          <w:rStyle w:val="FunctionTok"/>
+        </w:rPr>
+        <w:t xml:space="preserve">,</w:t>
+      </w:r>
+      <w:r>
+        <w:rPr>
+          <w:rStyle w:val="NormalTok"/>
+        </w:rPr>
+        <w:t xml:space="preserve"> </w:t>
+      </w:r>
+      <w:r>
+        <w:rPr>
+          <w:rStyle w:val="DataTypeTok"/>
+        </w:rPr>
+        <w:t xml:space="preserve">"doctor_name"</w:t>
+      </w:r>
+      <w:r>
+        <w:rPr>
+          <w:rStyle w:val="FunctionTok"/>
+        </w:rPr>
+        <w:t xml:space="preserve">:</w:t>
+      </w:r>
+      <w:r>
+        <w:rPr>
+          <w:rStyle w:val="NormalTok"/>
+        </w:rPr>
+        <w:t xml:space="preserve"> </w:t>
+      </w:r>
+      <w:r>
+        <w:rPr>
+          <w:rStyle w:val="StringTok"/>
+        </w:rPr>
+        <w:t xml:space="preserve">"Dr. Sharma"</w:t>
+      </w:r>
+      <w:r>
+        <w:rPr>
+          <w:rStyle w:val="FunctionTok"/>
+        </w:rPr>
+        <w:t xml:space="preserve">,</w:t>
+      </w:r>
+      <w:r>
+        <w:br/>
+      </w:r>
+      <w:r>
+        <w:rPr>
+          <w:rStyle w:val="NormalTok"/>
+        </w:rPr>
+        <w:t xml:space="preserve">             </w:t>
+      </w:r>
+      <w:r>
+        <w:rPr>
+          <w:rStyle w:val="DataTypeTok"/>
+        </w:rPr>
+        <w:t xml:space="preserve">"room_number"</w:t>
+      </w:r>
+      <w:r>
+        <w:rPr>
+          <w:rStyle w:val="FunctionTok"/>
+        </w:rPr>
+        <w:t xml:space="preserve">:</w:t>
+      </w:r>
+      <w:r>
+        <w:rPr>
+          <w:rStyle w:val="NormalTok"/>
+        </w:rPr>
+        <w:t xml:space="preserve"> </w:t>
+      </w:r>
+      <w:r>
+        <w:rPr>
+          <w:rStyle w:val="StringTok"/>
+        </w:rPr>
+        <w:t xml:space="preserve">"3"</w:t>
+      </w:r>
+      <w:r>
+        <w:rPr>
+          <w:rStyle w:val="FunctionTok"/>
+        </w:rPr>
+        <w:t xml:space="preserve">,</w:t>
+      </w:r>
+      <w:r>
+        <w:rPr>
+          <w:rStyle w:val="NormalTok"/>
+        </w:rPr>
+        <w:t xml:space="preserve"> </w:t>
+      </w:r>
+      <w:r>
+        <w:rPr>
+          <w:rStyle w:val="DataTypeTok"/>
+        </w:rPr>
+        <w:t xml:space="preserve">"token_display"</w:t>
+      </w:r>
+      <w:r>
+        <w:rPr>
+          <w:rStyle w:val="FunctionTok"/>
+        </w:rPr>
+        <w:t xml:space="preserve">:</w:t>
+      </w:r>
+      <w:r>
+        <w:rPr>
+          <w:rStyle w:val="NormalTok"/>
+        </w:rPr>
+        <w:t xml:space="preserve"> </w:t>
+      </w:r>
+      <w:r>
+        <w:rPr>
+          <w:rStyle w:val="StringTok"/>
+        </w:rPr>
+        <w:t xml:space="preserve">"MED-042"</w:t>
+      </w:r>
+      <w:r>
+        <w:rPr>
+          <w:rStyle w:val="FunctionTok"/>
+        </w:rPr>
+        <w:t xml:space="preserve">,</w:t>
+      </w:r>
+      <w:r>
+        <w:rPr>
+          <w:rStyle w:val="NormalTok"/>
+        </w:rPr>
+        <w:t xml:space="preserve"> </w:t>
+      </w:r>
+      <w:r>
+        <w:rPr>
+          <w:rStyle w:val="DataTypeTok"/>
+        </w:rPr>
+        <w:t xml:space="preserve">"now_serving"</w:t>
+      </w:r>
+      <w:r>
+        <w:rPr>
+          <w:rStyle w:val="FunctionTok"/>
+        </w:rPr>
+        <w:t xml:space="preserve">:</w:t>
+      </w:r>
+      <w:r>
+        <w:rPr>
+          <w:rStyle w:val="NormalTok"/>
+        </w:rPr>
+        <w:t xml:space="preserve"> </w:t>
+      </w:r>
+      <w:r>
+        <w:rPr>
+          <w:rStyle w:val="StringTok"/>
+        </w:rPr>
+        <w:t xml:space="preserve">"MED-042"</w:t>
+      </w:r>
+      <w:r>
+        <w:rPr>
+          <w:rStyle w:val="FunctionTok"/>
+        </w:rPr>
+        <w:t xml:space="preserve">}}</w:t>
+      </w:r>
+    </w:p>
+    <w:p>
+      <w:pPr>
+        <w:pStyle w:val="FirstParagraph"/>
+      </w:pPr>
+      <w:r>
+        <w:t xml:space="preserve">Same JSON is persisted to</w:t>
       </w:r>
       <w:r>
         <w:t xml:space="preserve"> </w:t>
@@ -15066,7 +15686,156 @@
         <w:t xml:space="preserve">notification_history.payload</w:t>
       </w:r>
       <w:r>
-        <w:t xml:space="preserve">).</w:t>
+        <w:t xml:space="preserve"> </w:t>
+      </w:r>
+      <w:r>
+        <w:t xml:space="preserve">(durable history). Redis pub/sub</w:t>
+      </w:r>
+      <w:r>
+        <w:t xml:space="preserve"> </w:t>
+      </w:r>
+      <w:r>
+        <w:t xml:space="preserve">is the fan-out:</w:t>
+      </w:r>
+      <w:r>
+        <w:t xml:space="preserve"> </w:t>
+      </w:r>
+      <w:r>
+        <w:rPr>
+          <w:rStyle w:val="VerbatimChar"/>
+        </w:rPr>
+        <w:t xml:space="preserve">call-next</w:t>
+      </w:r>
+      <w:r>
+        <w:t xml:space="preserve"> </w:t>
+      </w:r>
+      <w:r>
+        <w:t xml:space="preserve">publishes once, every connected display for that department</w:t>
+      </w:r>
+      <w:r>
+        <w:t xml:space="preserve"> </w:t>
+      </w:r>
+      <w:r>
+        <w:t xml:space="preserve">receives it.</w:t>
+      </w:r>
+      <w:r>
+        <w:t xml:space="preserve"> </w:t>
+      </w:r>
+      <w:r>
+        <w:rPr>
+          <w:b/>
+        </w:rPr>
+        <w:t xml:space="preserve">PII rule (repeat):</w:t>
+      </w:r>
+      <w:r>
+        <w:t xml:space="preserve"> </w:t>
+      </w:r>
+      <w:r>
+        <w:t xml:space="preserve">these payloads never carry patient name, UHID, or</w:t>
+      </w:r>
+      <w:r>
+        <w:t xml:space="preserve"> </w:t>
+      </w:r>
+      <w:r>
+        <w:t xml:space="preserve">mobile — only the token string, doctor, and room.</w:t>
+      </w:r>
+    </w:p>
+    <w:p>
+      <w:pPr>
+        <w:pStyle w:val="BodyText"/>
+      </w:pPr>
+      <w:r>
+        <w:rPr>
+          <w:b/>
+        </w:rPr>
+        <w:t xml:space="preserve">Flow for the patient standing outside OPD:</w:t>
+      </w:r>
+      <w:r>
+        <w:t xml:space="preserve"> </w:t>
+      </w:r>
+      <w:r>
+        <w:t xml:space="preserve">token</w:t>
+      </w:r>
+      <w:r>
+        <w:t xml:space="preserve"> </w:t>
+      </w:r>
+      <w:r>
+        <w:rPr>
+          <w:rStyle w:val="VerbatimChar"/>
+        </w:rPr>
+        <w:t xml:space="preserve">MED-042</w:t>
+      </w:r>
+      <w:r>
+        <w:t xml:space="preserve"> </w:t>
+      </w:r>
+      <w:r>
+        <w:t xml:space="preserve">printed at registration →</w:t>
+      </w:r>
+      <w:r>
+        <w:t xml:space="preserve"> </w:t>
+      </w:r>
+      <w:r>
+        <w:t xml:space="preserve">patient watches the department board → board shows</w:t>
+      </w:r>
+      <w:r>
+        <w:t xml:space="preserve"> </w:t>
+      </w:r>
+      <w:r>
+        <w:rPr>
+          <w:rStyle w:val="VerbatimChar"/>
+        </w:rPr>
+        <w:t xml:space="preserve">MED-039 now serving · Dr. Sharma · Room 3</w:t>
+      </w:r>
+      <w:r>
+        <w:t xml:space="preserve"> </w:t>
+      </w:r>
+      <w:r>
+        <w:t xml:space="preserve">and their</w:t>
+      </w:r>
+      <w:r>
+        <w:t xml:space="preserve"> </w:t>
+      </w:r>
+      <w:r>
+        <w:rPr>
+          <w:rStyle w:val="VerbatimChar"/>
+        </w:rPr>
+        <w:t xml:space="preserve">MED-042</w:t>
+      </w:r>
+      <w:r>
+        <w:t xml:space="preserve"> </w:t>
+      </w:r>
+      <w:r>
+        <w:t xml:space="preserve">in the waiting column → when the doctor presses</w:t>
+      </w:r>
+      <w:r>
+        <w:t xml:space="preserve"> </w:t>
+      </w:r>
+      <w:r>
+        <w:rPr>
+          <w:i/>
+        </w:rPr>
+        <w:t xml:space="preserve">Call next</w:t>
+      </w:r>
+      <w:r>
+        <w:t xml:space="preserve"> </w:t>
+      </w:r>
+      <w:r>
+        <w:t xml:space="preserve">and reaches them, the board flips to</w:t>
+      </w:r>
+      <w:r>
+        <w:t xml:space="preserve"> </w:t>
+      </w:r>
+      <w:r>
+        <w:rPr>
+          <w:rStyle w:val="VerbatimChar"/>
+        </w:rPr>
+        <w:t xml:space="preserve">MED-042 · Room 3</w:t>
+      </w:r>
+      <w:r>
+        <w:t xml:space="preserve"> </w:t>
+      </w:r>
+      <w:r>
+        <w:t xml:space="preserve">and (optionally) a chime fires.</w:t>
       </w:r>
     </w:p>
     <w:p>
@@ -18680,6 +19449,9 @@
     <w:abstractNumId w:val="991"/>
   </w:num>
   <w:num w:numId="1007">
+    <w:abstractNumId w:val="991"/>
+  </w:num>
+  <w:num w:numId="1008">
     <w:abstractNumId w:val="991"/>
   </w:num>
 </w:numbering>

</xml_diff>